<commit_message>
Add /liberate variant for Principal FDE — AI Agent Engineering
- New variant under src/content/variants/liberate.ts
- Hello card (no CTA) addresses the role explicitly + acknowledges
  insurance is the new domain (regulated-ops adjacency from telecom,
  healthcare, pharma, moderation)
- Hero retunes the "ambiguous workflows" tagline toward "production-grade
  agent systems — evaluated, observable, integrated"
- Operating model rewrites to 3 paragraphs, dropping the primer's
  "Production AI is not a prompt..." sentence verbatim
- Impact array: 8 items (Manual → Automated dropped, matches Adobe);
  Direct-to-Supplier 0→1 leads (closest FDE shape match per primer)
- One variant-only toolkit bucket: Agent Reliability / Eval Discipline
  (9 pills, no overlap with base, no voice/VoIP/insurance-core claims)
- Bumps RESUME.meta.lastReviewed → 2026-05-07

PDFs verified at 3 pages across all 4 variants (base + 3 tailored).

Co-Authored-By: Claude Opus 4.7 (1M context) <noreply@anthropic.com>
</commit_message>
<xml_diff>
--- a/public/adobe/leif-taylor-resume-adobe-2026-05.docx
+++ b/public/adobe/leif-taylor-resume-adobe-2026-05.docx
@@ -49,7 +49,7 @@
         </w:rPr>
         <w:t xml:space="preserve">Greater Boston Area  ·  </w:t>
       </w:r>
-      <w:hyperlink w:history="1" r:id="rIdgxzmzmkyp5tbr2o-e9l9b">
+      <w:hyperlink w:history="1" r:id="rIdjndawmssa_xxr18m35pyr">
         <w:r>
           <w:rPr>
             <w:rFonts w:ascii="Calibri" w:cs="Calibri" w:eastAsia="Calibri" w:hAnsi="Calibri"/>
@@ -70,7 +70,7 @@
         </w:rPr>
         <w:t xml:space="preserve">  ·  </w:t>
       </w:r>
-      <w:hyperlink w:history="1" r:id="rId6odlhpr7azaw0qb3cvk5k">
+      <w:hyperlink w:history="1" r:id="rIdig51b5lkghoz5l7y4jf6l">
         <w:r>
           <w:rPr>
             <w:rFonts w:ascii="Calibri" w:cs="Calibri" w:eastAsia="Calibri" w:hAnsi="Calibri"/>
@@ -91,7 +91,7 @@
         </w:rPr>
         <w:t xml:space="preserve">  ·  </w:t>
       </w:r>
-      <w:hyperlink w:history="1" r:id="rIdqxtnemggs_inmu83pgkhb">
+      <w:hyperlink w:history="1" r:id="rId_kzzcigno29ilqqjkme85">
         <w:r>
           <w:rPr>
             <w:rFonts w:ascii="Calibri" w:cs="Calibri" w:eastAsia="Calibri" w:hAnsi="Calibri"/>
@@ -1281,7 +1281,7 @@
       <w:pPr>
         <w:spacing w:after="120"/>
       </w:pPr>
-      <w:hyperlink w:history="1" r:id="rIdm_xd2sazbpblf5ruczkir">
+      <w:hyperlink w:history="1" r:id="rId0jig67wdfcmpzyj-ogedu">
         <w:r>
           <w:rPr>
             <w:rFonts w:ascii="Calibri" w:cs="Calibri" w:eastAsia="Calibri" w:hAnsi="Calibri"/>

</xml_diff>